<commit_message>
Updated Financial Policies and Procedures
</commit_message>
<xml_diff>
--- a/Finance Policies & Procedures/Contract Templates/Contract Templates - Home Office/Consultant Agreement/Consultant Agreement 2022-09 - Bilingual (Spanish).docx
+++ b/Finance Policies & Procedures/Contract Templates/Contract Templates - Home Office/Consultant Agreement/Consultant Agreement 2022-09 - Bilingual (Spanish).docx
@@ -44427,7 +44427,7 @@
 </file>
 
 <file path=word/theme/theme1.xml><?xml version="1.0" encoding="utf-8"?>
-<a:theme xmlns:a="http://schemas.openxmlformats.org/drawingml/2006/main" name="Office Theme">
+<a:theme xmlns:a="http://schemas.openxmlformats.org/drawingml/2006/main" xmlns:thm15="http://schemas.microsoft.com/office/thememl/2012/main" name="Office Theme">
   <a:themeElements>
     <a:clrScheme name="Office">
       <a:dk1>
@@ -44722,8 +44722,8 @@
 </file>
 
 <file path=customXml/item1.xml><?xml version="1.0" encoding="utf-8"?>
-<ct:contentTypeSchema xmlns:ct="http://schemas.microsoft.com/office/2006/metadata/contentType" xmlns:ma="http://schemas.microsoft.com/office/2006/metadata/properties/metaAttributes" ct:_="" ma:_="" ma:contentTypeName="Document" ma:contentTypeID="0x0101003206C8355D678A459F2EF8957171B231" ma:contentTypeVersion="18" ma:contentTypeDescription="Create a new document." ma:contentTypeScope="" ma:versionID="efd9b4af885478ed0a3e84c6362c6fb3">
-  <xsd:schema xmlns:xsd="http://www.w3.org/2001/XMLSchema" xmlns:xs="http://www.w3.org/2001/XMLSchema" xmlns:p="http://schemas.microsoft.com/office/2006/metadata/properties" xmlns:ns2="f2466082-b6bf-4153-98c3-3c41e85fda18" xmlns:ns3="dc808d36-874f-4b27-aec2-2fd649817929" targetNamespace="http://schemas.microsoft.com/office/2006/metadata/properties" ma:root="true" ma:fieldsID="3b6abc503e38a49174dd9e5072c65339" ns2:_="" ns3:_="">
+<ct:contentTypeSchema xmlns:ct="http://schemas.microsoft.com/office/2006/metadata/contentType" xmlns:ma="http://schemas.microsoft.com/office/2006/metadata/properties/metaAttributes" ct:_="" ma:_="" ma:contentTypeName="Document" ma:contentTypeID="0x0101003206C8355D678A459F2EF8957171B231" ma:contentTypeVersion="19" ma:contentTypeDescription="Create a new document." ma:contentTypeScope="" ma:versionID="a5577d833b9f28dcc6be37a04859b9a8">
+  <xsd:schema xmlns:xsd="http://www.w3.org/2001/XMLSchema" xmlns:xs="http://www.w3.org/2001/XMLSchema" xmlns:p="http://schemas.microsoft.com/office/2006/metadata/properties" xmlns:ns2="f2466082-b6bf-4153-98c3-3c41e85fda18" xmlns:ns3="dc808d36-874f-4b27-aec2-2fd649817929" targetNamespace="http://schemas.microsoft.com/office/2006/metadata/properties" ma:root="true" ma:fieldsID="ae50cb7862d574a2d96b6910b4abdc85" ns2:_="" ns3:_="">
     <xsd:import namespace="f2466082-b6bf-4153-98c3-3c41e85fda18"/>
     <xsd:import namespace="dc808d36-874f-4b27-aec2-2fd649817929"/>
     <xsd:element name="properties">
@@ -44749,6 +44749,7 @@
                 <xsd:element ref="ns3:TaxCatchAll" minOccurs="0"/>
                 <xsd:element ref="ns2:MediaServiceSearchProperties" minOccurs="0"/>
                 <xsd:element ref="ns2:MediaServiceObjectDetectorVersions" minOccurs="0"/>
+                <xsd:element ref="ns2:MediaServiceBillingMetadata" minOccurs="0"/>
               </xsd:all>
             </xsd:complexType>
           </xsd:element>
@@ -44833,6 +44834,11 @@
     <xsd:element name="MediaServiceObjectDetectorVersions" ma:index="25" nillable="true" ma:displayName="MediaServiceObjectDetectorVersions" ma:hidden="true" ma:indexed="true" ma:internalName="MediaServiceObjectDetectorVersions" ma:readOnly="true">
       <xsd:simpleType>
         <xsd:restriction base="dms:Text"/>
+      </xsd:simpleType>
+    </xsd:element>
+    <xsd:element name="MediaServiceBillingMetadata" ma:index="26" nillable="true" ma:displayName="MediaServiceBillingMetadata" ma:hidden="true" ma:internalName="MediaServiceBillingMetadata" ma:readOnly="true">
+      <xsd:simpleType>
+        <xsd:restriction base="dms:Note"/>
       </xsd:simpleType>
     </xsd:element>
   </xsd:schema>
@@ -44997,7 +45003,7 @@
 </file>
 
 <file path=customXml/itemProps1.xml><?xml version="1.0" encoding="utf-8"?>
-<ds:datastoreItem xmlns:ds="http://schemas.openxmlformats.org/officeDocument/2006/customXml" ds:itemID="{089FED23-755E-49CC-8919-3EB9F8D51B3E}"/>
+<ds:datastoreItem xmlns:ds="http://schemas.openxmlformats.org/officeDocument/2006/customXml" ds:itemID="{BFAD88C0-9EFA-4C19-AE57-308DB8BF138F}"/>
 </file>
 
 <file path=customXml/itemProps2.xml><?xml version="1.0" encoding="utf-8"?>

</xml_diff>